<commit_message>
Regenerate panel DOCX after examiner notebook cleanup
Co-authored-by: Cursor <cursoragent@cursor.com>
</commit_message>
<xml_diff>
--- a/docs/Project_Report.docx
+++ b/docs/Project_Report.docx
@@ -2913,11 +2913,18 @@
       <w:r/>
     </w:p>
     <w:p>
-      <w:pPr>
-        <w:pStyle w:val="ListNumber"/>
-      </w:pPr>
-      <w:r>
-        <w:t>Open `notebooks/local_pipeline.ipynb`.</w:t>
+      <w:r>
+        <w:t>The notebook is a short scientific demo only (setup → load model → OCR →</w:t>
+      </w:r>
+    </w:p>
+    <w:p>
+      <w:r>
+        <w:t>predictions → metrics → curves). Long instructions, training, and optional</w:t>
+      </w:r>
+    </w:p>
+    <w:p>
+      <w:r>
+        <w:t>generation live in this report / README / FAQ — not in the notebook cells.</w:t>
       </w:r>
     </w:p>
     <w:p>
@@ -2925,7 +2932,7 @@
         <w:pStyle w:val="ListNumber"/>
       </w:pPr>
       <w:r>
-        <w:t>Optionally set `TEST_IMAGE_PATH` (or leave empty for the file picker).</w:t>
+        <w:t>Place `models/crnn_best.pth` under `models/`.</w:t>
       </w:r>
     </w:p>
     <w:p>
@@ -2933,7 +2940,20 @@
         <w:pStyle w:val="ListNumber"/>
       </w:pPr>
       <w:r>
-        <w:t>Keep install/training off (`RUN_INSTALL=False`).</w:t>
+        <w:t>Open `notebooks/local_pipeline.ipynb`.</w:t>
+      </w:r>
+    </w:p>
+    <w:p>
+      <w:pPr>
+        <w:pStyle w:val="ListNumber"/>
+      </w:pPr>
+      <w:r>
+        <w:t>Optionally set `TEST_IMAGE_PATH` (empty → file picker → bundled</w:t>
+      </w:r>
+    </w:p>
+    <w:p>
+      <w:r>
+        <w:t>`page_song_lyrics.jpg`).</w:t>
       </w:r>
     </w:p>
     <w:p>
@@ -2956,12 +2976,22 @@
         <w:pStyle w:val="ListNumber"/>
       </w:pPr>
       <w:r>
-        <w:t>Inspect Sections 4–5 (boxes + Sinhala predictions), Section 6 (metrics /</w:t>
+        <w:t>Inspect: page boxes, per-line Sinhala predictions, CER/WER with accuracy %,</w:t>
       </w:r>
     </w:p>
     <w:p>
       <w:r>
-        <w:t>accuracy %), Section 7 (curves + held-out bars).</w:t>
+        <w:t>training curves and held-out CER bars.</w:t>
+      </w:r>
+    </w:p>
+    <w:p>
+      <w:r>
+        <w:t>Missing checkpoint raises a single short `FileNotFoundError` (no setup tutorial</w:t>
+      </w:r>
+    </w:p>
+    <w:p>
+      <w:r>
+        <w:t>in the notebook).</w:t>
       </w:r>
     </w:p>
     <w:p>
@@ -2975,7 +3005,7 @@
           <w:rFonts w:ascii="Consolas" w:hAnsi="Consolas"/>
           <w:sz w:val="18"/>
         </w:rPr>
-        <w:t>$env:OCR_TEST_IMAGE="data/eval_real/print_photos/page_poem_print.jpg"</w:t>
+        <w:t>$env:OCR_TEST_IMAGE="data/eval_real/print_photos/page_song_lyrics.jpg"</w:t>
         <w:br/>
         <w:t>jupyter nbconvert --to notebook --execute --inplace notebooks/local_pipeline.ipynb</w:t>
       </w:r>

</xml_diff>

<commit_message>
Sync panel docs and README to §3g held-out accuracy.
Commit 1448ba4 updated RESULTS/eval_summary; bring Project Report, FAQ, and README headline tables to Word Acc 85.09% / Char Acc 96.75%.

Co-authored-by: Cursor <cursoragent@cursor.com>
</commit_message>
<xml_diff>
--- a/docs/Project_Report.docx
+++ b/docs/Project_Report.docx
@@ -165,7 +165,7 @@
         <w:rPr>
           <w:b/>
         </w:rPr>
-        <w:t>CER 0.0455</w:t>
+        <w:t>CER 0.0325</w:t>
       </w:r>
       <w:r>
         <w:t xml:space="preserve"> (</w:t>
@@ -174,7 +174,7 @@
         <w:rPr>
           <w:b/>
         </w:rPr>
-        <w:t>Character Accuracy 95.45%</w:t>
+        <w:t>Character Accuracy 96.75%</w:t>
       </w:r>
       <w:r>
         <w:t>)</w:t>
@@ -188,7 +188,7 @@
         <w:rPr>
           <w:b/>
         </w:rPr>
-        <w:t>WER 0.2193</w:t>
+        <w:t>WER 0.1491</w:t>
       </w:r>
       <w:r>
         <w:t xml:space="preserve"> (</w:t>
@@ -197,7 +197,7 @@
         <w:rPr>
           <w:b/>
         </w:rPr>
-        <w:t>Word Accuracy 78.07%</w:t>
+        <w:t>Word Accuracy 85.09%</w:t>
       </w:r>
       <w:r>
         <w:t>). On held-out synthetic pages the</w:t>
@@ -467,7 +467,7 @@
         <w:rPr>
           <w:b/>
         </w:rPr>
-        <w:t>95.45%</w:t>
+        <w:t>96.75%</w:t>
       </w:r>
       <w:r>
         <w:t xml:space="preserve"> (CER</w:t>
@@ -475,17 +475,31 @@
     </w:p>
     <w:p>
       <w:r>
-        <w:t>0.0455). Remaining errors concentrate on very low-resolution lyric text and a few</w:t>
+        <w:t xml:space="preserve">0.0325) and Word Accuracy </w:t>
+      </w:r>
+      <w:r>
+        <w:rPr>
+          <w:b/>
+        </w:rPr>
+        <w:t>85.09%</w:t>
+      </w:r>
+      <w:r>
+        <w:t xml:space="preserve"> (WER 0.1491). Remaining errors concentrate</w:t>
       </w:r>
     </w:p>
     <w:p>
       <w:r>
-        <w:t>serif-print confusions (`ු`/`ූ`, `ේ`/`ී`). The delivered artefact is one general</w:t>
+        <w:t>on very low-resolution lyric text and a few serif-print confusions (`ු`/`ූ`,</w:t>
       </w:r>
     </w:p>
     <w:p>
       <w:r>
-        <w:t>checkpoint plus a Jupyter demo that examiners can run without retraining.</w:t>
+        <w:t>`ේ`/`ී`). The delivered artefact is one general checkpoint plus a Jupyter demo</w:t>
+      </w:r>
+    </w:p>
+    <w:p>
+      <w:r>
+        <w:t>that examiners can run without retraining.</w:t>
       </w:r>
     </w:p>
     <w:p/>
@@ -2281,7 +2295,7 @@
           </w:tcPr>
           <w:p>
             <w:r>
-              <w:t>**0.0455**</w:t>
+              <w:t>**0.0325**</w:t>
             </w:r>
           </w:p>
         </w:tc>
@@ -2291,7 +2305,7 @@
           </w:tcPr>
           <w:p>
             <w:r>
-              <w:t>**95.45**</w:t>
+              <w:t>**96.75**</w:t>
             </w:r>
           </w:p>
         </w:tc>
@@ -2301,7 +2315,7 @@
           </w:tcPr>
           <w:p>
             <w:r>
-              <w:t>**0.2193**</w:t>
+              <w:t>**0.1491**</w:t>
             </w:r>
           </w:p>
         </w:tc>
@@ -2311,7 +2325,7 @@
           </w:tcPr>
           <w:p>
             <w:r>
-              <w:t>**78.07**</w:t>
+              <w:t>**85.09**</w:t>
             </w:r>
           </w:p>
         </w:tc>
@@ -2794,21 +2808,50 @@
         <w:t>Lyric polish (Aug-01)</w:t>
       </w:r>
       <w:r>
-        <w:t xml:space="preserve"> — CER 0.0552 → </w:t>
-      </w:r>
+        <w:t xml:space="preserve"> — CER 0.0552 → 0.0455 on real photos; no</w:t>
+      </w:r>
+    </w:p>
+    <w:p>
+      <w:r>
+        <w:t>regression on `eval_pages` / `adversarial`.</w:t>
+      </w:r>
+    </w:p>
+    <w:p>
+      <w:pPr>
+        <w:pStyle w:val="ListNumber"/>
+      </w:pPr>
+      <w:r/>
       <w:r>
         <w:rPr>
           <w:b/>
         </w:rPr>
-        <w:t>0.0455</w:t>
-      </w:r>
-      <w:r>
-        <w:t xml:space="preserve"> on real photos; no</w:t>
+        <w:t>Word-accuracy push (§3g)</w:t>
+      </w:r>
+      <w:r>
+        <w:t xml:space="preserve"> — CER </w:t>
+      </w:r>
+      <w:r>
+        <w:rPr>
+          <w:b/>
+        </w:rPr>
+        <w:t>0.0325</w:t>
+      </w:r>
+      <w:r>
+        <w:t xml:space="preserve"> / Word Acc </w:t>
+      </w:r>
+      <w:r>
+        <w:rPr>
+          <w:b/>
+        </w:rPr>
+        <w:t>85.09%</w:t>
+      </w:r>
+      <w:r>
+        <w:t xml:space="preserve"> on real</w:t>
       </w:r>
     </w:p>
     <w:p>
       <w:r>
-        <w:t>regression on `eval_pages` / `adversarial`.</w:t>
+        <w:t>photos via safe word-level post-correct rules (checkpoint unchanged).</w:t>
       </w:r>
     </w:p>
     <w:p>
@@ -3162,30 +3205,42 @@
         <w:rPr>
           <w:b/>
         </w:rPr>
-        <w:t>95.45% Character Accuracy</w:t>
-      </w:r>
-      <w:r>
-        <w:t xml:space="preserve"> (CER 0.0455). The work emphasises reproducible</w:t>
-      </w:r>
+        <w:t>96.75% Character Accuracy</w:t>
+      </w:r>
+      <w:r>
+        <w:t xml:space="preserve"> (CER 0.0325) and </w:t>
+      </w:r>
+      <w:r>
+        <w:rPr>
+          <w:b/>
+        </w:rPr>
+        <w:t>85.09% Word Accuracy</w:t>
+      </w:r>
+      <w:r/>
     </w:p>
     <w:p>
       <w:r>
-        <w:t>evaluation and transparent limitations: the real holdout is still small, and</w:t>
+        <w:t>(WER 0.1491). The work emphasises reproducible evaluation and transparent</w:t>
       </w:r>
     </w:p>
     <w:p>
       <w:r>
-        <w:t>synthetic validation must not be trusted alone. The repository, checkpoint, and</w:t>
+        <w:t>limitations: the real holdout is still small, and synthetic validation must not</w:t>
       </w:r>
     </w:p>
     <w:p>
       <w:r>
-        <w:t>demo notebook are organised so that a review panel can inspect both the method</w:t>
+        <w:t>be trusted alone. The repository, checkpoint, and demo notebook are organised so</w:t>
       </w:r>
     </w:p>
     <w:p>
       <w:r>
-        <w:t>and the numbers without retraining.</w:t>
+        <w:t>that a review panel can inspect both the method and the numbers without</w:t>
+      </w:r>
+    </w:p>
+    <w:p>
+      <w:r>
+        <w:t>retraining.</w:t>
       </w:r>
     </w:p>
     <w:p/>

</xml_diff>

<commit_message>
Add Colab image upload and optional training appendix for examiners.
Keep Restart and Run All inference-only by default while making live upload the Colab demo path and exposing a short/full train cell for viva.

Co-authored-by: Cursor <cursoragent@cursor.com>
</commit_message>
<xml_diff>
--- a/docs/Project_Report.docx
+++ b/docs/Project_Report.docx
@@ -2957,17 +2957,40 @@
     </w:p>
     <w:p>
       <w:r>
-        <w:t>The notebook is a short scientific demo only (setup → load model → OCR →</w:t>
+        <w:t xml:space="preserve">Default demo is </w:t>
+      </w:r>
+      <w:r>
+        <w:rPr>
+          <w:b/>
+        </w:rPr>
+        <w:t>inference-only</w:t>
+      </w:r>
+      <w:r>
+        <w:t>: setup → load model → OCR → predictions →</w:t>
       </w:r>
     </w:p>
     <w:p>
       <w:r>
-        <w:t>predictions → metrics → curves). Long instructions, training, and optional</w:t>
+        <w:t xml:space="preserve">metrics → curves. An </w:t>
+      </w:r>
+      <w:r>
+        <w:rPr>
+          <w:b/>
+        </w:rPr>
+        <w:t>Optional: Training</w:t>
+      </w:r>
+      <w:r>
+        <w:t xml:space="preserve"> appendix sits at the end with</w:t>
       </w:r>
     </w:p>
     <w:p>
       <w:r>
-        <w:t>generation live in this report / README / FAQ — not in the notebook cells.</w:t>
+        <w:t>`RUN_TRAIN = False` so Run all stays short; set it `True` only for viva</w:t>
+      </w:r>
+    </w:p>
+    <w:p>
+      <w:r>
+        <w:t>questions about the train loop / epoch status.</w:t>
       </w:r>
     </w:p>
     <w:p>
@@ -2983,7 +3006,7 @@
         <w:pStyle w:val="ListNumber"/>
       </w:pPr>
       <w:r>
-        <w:t>Open `notebooks/local_pipeline.ipynb`.</w:t>
+        <w:t>Open `notebooks/local_pipeline.ipynb` (or Colab: see `COLAB.md`).</w:t>
       </w:r>
     </w:p>
     <w:p>
@@ -2991,12 +3014,17 @@
         <w:pStyle w:val="ListNumber"/>
       </w:pPr>
       <w:r>
-        <w:t>Optionally set `TEST_IMAGE_PATH` (empty → file picker → bundled</w:t>
+        <w:t>Pick a real image: local file picker when `TEST_IMAGE_PATH` is empty; on</w:t>
       </w:r>
     </w:p>
     <w:p>
       <w:r>
-        <w:t>`page_song_lyrics.jpg`).</w:t>
+        <w:t>Colab, `USE_UPLOAD = True` (default) opens `files.upload()` and saves under</w:t>
+      </w:r>
+    </w:p>
+    <w:p>
+      <w:r>
+        <w:t>`data/uploads/`. Cancel → bundled `page_song_lyrics.jpg`.</w:t>
       </w:r>
     </w:p>
     <w:p>
@@ -3025,6 +3053,43 @@
     <w:p>
       <w:r>
         <w:t>training curves and held-out CER bars.</w:t>
+      </w:r>
+    </w:p>
+    <w:p>
+      <w:r/>
+      <w:r>
+        <w:rPr>
+          <w:b/>
+        </w:rPr>
+        <w:t>Optional training (viva):</w:t>
+      </w:r>
+      <w:r>
+        <w:t xml:space="preserve"> with `RUN_TRAIN = True`, `TRAIN_MODE = "short"`</w:t>
+      </w:r>
+    </w:p>
+    <w:p>
+      <w:r>
+        <w:t>runs a few epochs on a small synthetic sample and saves best weights to</w:t>
+      </w:r>
+    </w:p>
+    <w:p>
+      <w:r>
+        <w:t>`models/crnn_best.pth` (resume keeps the prior best CER bar). This only</w:t>
+      </w:r>
+    </w:p>
+    <w:p>
+      <w:r>
+        <w:t>demonstrates the loop; the delivered model used the full schedule in this</w:t>
+      </w:r>
+    </w:p>
+    <w:p>
+      <w:r>
+        <w:t>report / `configs/`. `TRAIN_MODE = "full"` continues with the chosen config and</w:t>
+      </w:r>
+    </w:p>
+    <w:p>
+      <w:r>
+        <w:t>can take hours.</w:t>
       </w:r>
     </w:p>
     <w:p>

</xml_diff>